<commit_message>
Mejora interfaz, documentación y evidencias EPE3
</commit_message>
<xml_diff>
--- a/entregables/Maqueta_Informe_EPE3.docx
+++ b/entregables/Maqueta_Informe_EPE3.docx
@@ -93,12 +93,12 @@
     </w:p>
     <w:p>
       <w:r>
-        <w:t>La versión actual es una maqueta de trabajo con un prototipo ejecutable. Los resultados técnicos provienen de una ejecución sobre datos sintéticos generados para el ejercicio. No se dispone de registros empresariales, de la EPE 2 completa ni de pruebas con usuarios. Por eso, las métricas no acreditan mejoras reales de inventario, ahorro ni capacidad productiva.</w:t>
+        <w:t>El prototipo es ejecutable, pero los resultados técnicos provienen de datos sintéticos. No se dispone de registros empresariales, de la EPE 2 completa ni de pruebas con usuarios. Por eso, las métricas no acreditan mejoras reales de inventario, ahorro ni capacidad productiva.</w:t>
       </w:r>
     </w:p>
     <w:p>
       <w:r>
-        <w:t>La pauta solicita informe en PDF, código en GitHub y presentación PowerPoint con evidencia. El informe utiliza Calibri 12, márgenes de 3 cm, interlineado 1,5 y alineación justificada. Se reservan diez páginas para el desarrollo, organizadas en las cuatro partes de la actividad. Los espacios de trabajo deben convertirse en análisis y evidencias antes de la entrega final.</w:t>
+        <w:t>La pauta solicita informe en PDF, código en GitHub y presentación PowerPoint con evidencia. El informe utiliza Calibri 12, márgenes de 3 cm, interlineado 1,5 y alineación justificada. El desarrollo cubre diseño, implementación, evaluación y documentación, con evidencia visual de la ejecución local.</w:t>
       </w:r>
     </w:p>
     <w:p>
@@ -141,10 +141,7 @@
     </w:p>
     <w:p>
       <w:r>
-        <w:rPr>
-          <w:i/>
-        </w:rPr>
-        <w:t>Completar: describir empresa y área, problema observado, evidencia del diagnóstico anterior, quién toma la decisión y qué consecuencia tiene equivocarse. Incorporar un indicador empresarial con fuente y período. No inventar montos, porcentajes ni entrevistas.</w:t>
+        <w:t>Trazabilidad propuesta con EPE 2: diagnóstico a verificar = dificultad para anticipar demanda por zona; causa raíz hipotética = planificación basada en demanda pasada sin integrar calendario y promoción; objetivo empresarial = revisar inventario y despacho antes de la ruta. La implementación traduce ese diagnóstico en variables, modelo y consulta web. Revisar el texto exacto de EPE 2 antes de entregar.</w:t>
       </w:r>
     </w:p>
     <w:p>
@@ -223,10 +220,7 @@
     </w:p>
     <w:p>
       <w:r>
-        <w:rPr>
-          <w:i/>
-        </w:rPr>
-        <w:t>Completar: diccionario empresarial, origen y autorización de datos, fecha de extracción, cobertura, duplicados, faltantes y tratamiento de ventas limitadas por falta de stock. Las ventas observadas pueden subestimar demanda no atendida.</w:t>
+        <w:t>Con datos reales, el ERP aportaría fecha, zona/ruta, productos y unidades de pedidos o ventas; el WMS aportaría inventario disponible, quiebres y movimientos; el calendario comercial aportaría promociones. Se debería construir demanda_lag7 por ruta y distinguir ventas censuradas por falta de stock de demanda verdadera. Son campos propuestos, no datos actualmente integrados.</w:t>
       </w:r>
     </w:p>
     <w:p>
@@ -313,6 +307,11 @@
     </w:p>
     <w:p>
       <w:r>
+        <w:t>Variable transformada con mayor magnitud en el modelo: remainder__promocion (coeficiente 22.14). Coeficientes del modelo lineal; describen asociación condicional, no causalidad. Categorías one-hot y escalas distintas limitan comparaciones directas.</w:t>
+      </w:r>
+    </w:p>
+    <w:p>
+      <w:r>
         <w:br w:type="page"/>
       </w:r>
     </w:p>
@@ -326,7 +325,7 @@
     </w:p>
     <w:p>
       <w:r>
-        <w:t>La interfaz utiliza listas de selección para zona, día, mes y promoción, y un campo numérico para demanda histórica. Las etiquetas están asociadas a los controles, el resultado se anuncia en una región de actualización y el diseño reorganiza las columnas en pantallas pequeñas.</w:t>
+        <w:t>La interfaz permite seleccionar ruta, fecha mediante calendario, promoción y demanda observada hace siete días. Deriva día y mes de la fecha, informa el tiempo de espera y muestra una recomendación según el promedio sintético reciente de la ruta. Expone las métricas, el historial y el error RMSE de test; el ± RMSE es una referencia aproximada, no un intervalo de confianza.</w:t>
       </w:r>
     </w:p>
     <w:p>
@@ -346,10 +345,7 @@
     </w:p>
     <w:p>
       <w:r>
-        <w:rPr>
-          <w:i/>
-        </w:rPr>
-        <w:t>Completar: incorporar capturas del formulario, del resultado y de una entrada inválida. Describir la diferencia entre validar el formulario y validar la API, dado que un cliente externo puede omitir la interfaz.</w:t>
+        <w:t>La validación de la API permanece necesaria aunque exista un formulario: clientes externos pueden omitir la interfaz. La versión final debe incluir capturas actualizadas del formulario, resultado, mensaje de error y /docs.</w:t>
       </w:r>
     </w:p>
     <w:p>
@@ -377,7 +373,7 @@
     </w:p>
     <w:p>
       <w:r>
-        <w:t>El menor error del modelo frente a esta línea base respalda su utilidad para la demostración. No prueba reducción de quiebres de stock ni ahorros reales. Tampoco significa que todas las predicciones estarán dentro de un margen igual al MAE.</w:t>
+        <w:t>El menor error frente a la línea base respalda la demostración. No prueba reducción de quiebres de stock ni ahorros reales. El ± RMSE expuesto en la web resume el error cuadrático de test y no garantiza cobertura para una predicción individual.</w:t>
       </w:r>
     </w:p>
     <w:p>
@@ -387,10 +383,192 @@
     </w:p>
     <w:p>
       <w:r>
-        <w:rPr>
-          <w:i/>
-        </w:rPr>
-        <w:t>Completar: agregar tabla de error por zona y gráfico de observado frente a predicho. Analizar al menos dos errores grandes y su posible consecuencia operativa. No volver a seleccionar hiperparámetros usando el test sin reservar una nueva evaluación independiente.</w:t>
+        <w:t>El gráfico de residuos compara predicción y error real menos predicción, coloreado por zona. Su dispersión en torno a cero sirve como inspección visual; por sí sola no demuestra ausencia de sesgo sistemático. El análisis por zona, promoción y tipo de día está en metricas.json.</w:t>
+      </w:r>
+    </w:p>
+    <w:tbl>
+      <w:tblPr>
+        <w:tblStyle w:val="TableGrid"/>
+        <w:tblW w:type="auto" w:w="0"/>
+        <w:tblLook w:firstColumn="1" w:firstRow="1" w:lastColumn="0" w:lastRow="0" w:noHBand="0" w:noVBand="1" w:val="04A0"/>
+      </w:tblPr>
+      <w:tblGrid>
+        <w:gridCol w:w="2126"/>
+        <w:gridCol w:w="2126"/>
+        <w:gridCol w:w="2126"/>
+        <w:gridCol w:w="2126"/>
+      </w:tblGrid>
+      <w:tr>
+        <w:tc>
+          <w:tcPr>
+            <w:tcW w:type="dxa" w:w="2126"/>
+          </w:tcPr>
+          <w:p>
+            <w:r>
+              <w:t>Método</w:t>
+            </w:r>
+          </w:p>
+        </w:tc>
+        <w:tc>
+          <w:tcPr>
+            <w:tcW w:type="dxa" w:w="2126"/>
+          </w:tcPr>
+          <w:p>
+            <w:r>
+              <w:t>MAE</w:t>
+            </w:r>
+          </w:p>
+        </w:tc>
+        <w:tc>
+          <w:tcPr>
+            <w:tcW w:type="dxa" w:w="2126"/>
+          </w:tcPr>
+          <w:p>
+            <w:r>
+              <w:t>RMSE</w:t>
+            </w:r>
+          </w:p>
+        </w:tc>
+        <w:tc>
+          <w:tcPr>
+            <w:tcW w:type="dxa" w:w="2126"/>
+          </w:tcPr>
+          <w:p>
+            <w:r>
+              <w:t>R²</w:t>
+            </w:r>
+          </w:p>
+        </w:tc>
+      </w:tr>
+      <w:tr>
+        <w:tc>
+          <w:tcPr>
+            <w:tcW w:type="dxa" w:w="2126"/>
+          </w:tcPr>
+          <w:p>
+            <w:r>
+              <w:t>Modelo seleccionado</w:t>
+            </w:r>
+          </w:p>
+        </w:tc>
+        <w:tc>
+          <w:tcPr>
+            <w:tcW w:type="dxa" w:w="2126"/>
+          </w:tcPr>
+          <w:p>
+            <w:r>
+              <w:t>6.41</w:t>
+            </w:r>
+          </w:p>
+        </w:tc>
+        <w:tc>
+          <w:tcPr>
+            <w:tcW w:type="dxa" w:w="2126"/>
+          </w:tcPr>
+          <w:p>
+            <w:r>
+              <w:t>8.07</w:t>
+            </w:r>
+          </w:p>
+        </w:tc>
+        <w:tc>
+          <w:tcPr>
+            <w:tcW w:type="dxa" w:w="2126"/>
+          </w:tcPr>
+          <w:p>
+            <w:r>
+              <w:t>0.842</w:t>
+            </w:r>
+          </w:p>
+        </w:tc>
+      </w:tr>
+      <w:tr>
+        <w:tc>
+          <w:tcPr>
+            <w:tcW w:type="dxa" w:w="2126"/>
+          </w:tcPr>
+          <w:p>
+            <w:r>
+              <w:t>Persistencia semanal</w:t>
+            </w:r>
+          </w:p>
+        </w:tc>
+        <w:tc>
+          <w:tcPr>
+            <w:tcW w:type="dxa" w:w="2126"/>
+          </w:tcPr>
+          <w:p>
+            <w:r>
+              <w:t>13.70</w:t>
+            </w:r>
+          </w:p>
+        </w:tc>
+        <w:tc>
+          <w:tcPr>
+            <w:tcW w:type="dxa" w:w="2126"/>
+          </w:tcPr>
+          <w:p>
+            <w:r>
+              <w:t>17.51</w:t>
+            </w:r>
+          </w:p>
+        </w:tc>
+        <w:tc>
+          <w:tcPr>
+            <w:tcW w:type="dxa" w:w="2126"/>
+          </w:tcPr>
+          <w:p>
+            <w:r>
+              <w:t>0.254</w:t>
+            </w:r>
+          </w:p>
+        </w:tc>
+      </w:tr>
+    </w:tbl>
+    <w:p>
+      <w:r>
+        <w:t>Tabla 1. Comparación sobre las mismas 580 filas de test; MAE y RMSE en unidades.</w:t>
+      </w:r>
+    </w:p>
+    <w:p>
+      <w:r>
+        <w:drawing>
+          <wp:inline xmlns:a="http://schemas.openxmlformats.org/drawingml/2006/main" xmlns:pic="http://schemas.openxmlformats.org/drawingml/2006/picture">
+            <wp:extent cx="5220000" cy="1740000"/>
+            <wp:docPr id="1" name="Picture 1"/>
+            <wp:cNvGraphicFramePr>
+              <a:graphicFrameLocks noChangeAspect="1"/>
+            </wp:cNvGraphicFramePr>
+            <a:graphic>
+              <a:graphicData uri="http://schemas.openxmlformats.org/drawingml/2006/picture">
+                <pic:pic>
+                  <pic:nvPicPr>
+                    <pic:cNvPr id="0" name="residuos_test.png"/>
+                    <pic:cNvPicPr/>
+                  </pic:nvPicPr>
+                  <pic:blipFill>
+                    <a:blip r:embed="rId10"/>
+                    <a:stretch>
+                      <a:fillRect/>
+                    </a:stretch>
+                  </pic:blipFill>
+                  <pic:spPr>
+                    <a:xfrm>
+                      <a:off x="0" y="0"/>
+                      <a:ext cx="5220000" cy="1740000"/>
+                    </a:xfrm>
+                    <a:prstGeom prst="rect"/>
+                  </pic:spPr>
+                </pic:pic>
+              </a:graphicData>
+            </a:graphic>
+          </wp:inline>
+        </w:drawing>
+      </w:r>
+    </w:p>
+    <w:p>
+      <w:r>
+        <w:t>Figura 1. Residuos por zona en el test temporal; fuente: predicciones_test.csv.</w:t>
       </w:r>
     </w:p>
     <w:p>
@@ -408,7 +586,7 @@
     </w:p>
     <w:p>
       <w:r>
-        <w:t>La suite automatizada terminó con 16 pruebas aprobadas. Incluye predicción válida, validación de rangos y tipos, claves adicionales, cuerpos incompletos, modelo ausente, carga del formulario, comunicación web/API con cliente de pruebas, mensaje ante desconexión y límites temporales.</w:t>
+        <w:t>La suite automatizada terminó con 22 pruebas aprobadas. Incluye predicción válida, validación de rangos y tipos, claves adicionales, cuerpos incompletos, modelo ausente, carga del formulario, comunicación web/API, caída de la API, estado de salud del flujo completo, documentación sin CDN, información visible del modelo y límites temporales.</w:t>
       </w:r>
     </w:p>
     <w:p>
@@ -418,7 +596,7 @@
     </w:p>
     <w:p>
       <w:r>
-        <w:t>La medición local envió 100 solicitudes con concurrencia de 10 a cada flujo. API: 0 errores y p95 52.2 ms. Web con consulta a API: 0 errores y p95 96.3 ms. Se hizo una solicitud previa de calentamiento por flujo.</w:t>
+        <w:t>La medición local envió 100 solicitudes con concurrencia de 10 a cada flujo. API: 0 errores y p95 41.9 ms. Web con consulta a API: 0 errores y p95 85.5 ms. Se hizo una solicitud previa de calentamiento por flujo.</w:t>
       </w:r>
     </w:p>
     <w:p>
@@ -454,7 +632,7 @@
     </w:p>
     <w:p>
       <w:r>
-        <w:t>Protocolo propuesto: invitar de tres a cinco personas representativas a generar una predicción, cambiar la promoción, recuperarse de un dato inválido y explicar el resultado. Registrar éxito por tarea, tiempo, errores y claridad percibida, sin datos personales innecesarios.</w:t>
+        <w:t>Protocolo de cinco minutos: pedir a tres a cinco personas que obtengan una predicción para la ruta 2 el próximo sábado con promoción activa. Cronometrar desde la instrucción hasta que identifican la cifra y registrar si completaron sin ayuda y un comentario. El archivo PROTOCOLO_USABILIDAD.md contiene la hoja en blanco; no hay resultados inventados.</w:t>
       </w:r>
     </w:p>
     <w:p>
@@ -500,7 +678,7 @@
     </w:p>
     <w:p>
       <w:r>
-        <w:t>El repositorio está preparado localmente, pero no está publicado en GitHub. La entrega requiere crear el repositorio en la cuenta del estudiante, subir el código y verificar las instrucciones desde un clon limpio. No sustituir este paso por un enlace ficticio.</w:t>
+        <w:t>Repositorio del proyecto: https://github.com/RenatoLV/EPE3-IPCHILE-ING. Antes de entregar, comprobar acceso del docente y reproducir desde un clon limpio. El informe y la presentación deben corresponder al mismo commit publicado.</w:t>
       </w:r>
     </w:p>
     <w:p>
@@ -514,6 +692,134 @@
           <w:i/>
         </w:rPr>
         <w:t>Completar: URL real del repositorio, inventario de evidencias, instrucciones de reproducción verificadas y captura de la versión entregada. Revisar que el desarrollo final tenga de diez a quince páginas sustantivas, sin contar portada, introducción, conclusión ni bibliografía.</w:t>
+      </w:r>
+    </w:p>
+    <w:p>
+      <w:r>
+        <w:br w:type="page"/>
+      </w:r>
+    </w:p>
+    <w:p>
+      <w:pPr>
+        <w:pStyle w:val="Heading1"/>
+      </w:pPr>
+      <w:r>
+        <w:t>11 Evidencia visual del flujo web</w:t>
+      </w:r>
+    </w:p>
+    <w:p>
+      <w:r>
+        <w:t>Captura de la versión final en ejecución local con Docker Compose. El ejemplo selecciona la ruta 1, el sábado 19 de septiembre de 2026, promoción activa y demanda observada de 95 unidades siete días antes. La respuesta fue 113,7 unidades con referencia de ± 8,1 unidades de RMSE de test.</w:t>
+      </w:r>
+    </w:p>
+    <w:p>
+      <w:r>
+        <w:t>La recomendación compara la estimación con el promedio de los últimos 21 registros sintéticos de esa ruta. Este promedio sirve como contexto de demostración; el historial termina en 2024 y no representa la demanda real de 2026.</w:t>
+      </w:r>
+    </w:p>
+    <w:p>
+      <w:r>
+        <w:drawing>
+          <wp:inline xmlns:a="http://schemas.openxmlformats.org/drawingml/2006/main" xmlns:pic="http://schemas.openxmlformats.org/drawingml/2006/picture">
+            <wp:extent cx="5184000" cy="4174130"/>
+            <wp:docPr id="2" name="Picture 2"/>
+            <wp:cNvGraphicFramePr>
+              <a:graphicFrameLocks noChangeAspect="1"/>
+            </wp:cNvGraphicFramePr>
+            <a:graphic>
+              <a:graphicData uri="http://schemas.openxmlformats.org/drawingml/2006/picture">
+                <pic:pic>
+                  <pic:nvPicPr>
+                    <pic:cNvPr id="0" name="interfaz_resumen.png"/>
+                    <pic:cNvPicPr/>
+                  </pic:nvPicPr>
+                  <pic:blipFill>
+                    <a:blip r:embed="rId11"/>
+                    <a:stretch>
+                      <a:fillRect/>
+                    </a:stretch>
+                  </pic:blipFill>
+                  <pic:spPr>
+                    <a:xfrm>
+                      <a:off x="0" y="0"/>
+                      <a:ext cx="5184000" cy="4174130"/>
+                    </a:xfrm>
+                    <a:prstGeom prst="rect"/>
+                  </pic:spPr>
+                </pic:pic>
+              </a:graphicData>
+            </a:graphic>
+          </wp:inline>
+        </w:drawing>
+      </w:r>
+    </w:p>
+    <w:p>
+      <w:r>
+        <w:t>Figura 2. Formulario y resultado del prototipo en ejecución local.</w:t>
+      </w:r>
+    </w:p>
+    <w:p>
+      <w:r>
+        <w:br w:type="page"/>
+      </w:r>
+    </w:p>
+    <w:p>
+      <w:pPr>
+        <w:pStyle w:val="Heading1"/>
+      </w:pPr>
+      <w:r>
+        <w:t>12 Evidencia de API y despliegue</w:t>
+      </w:r>
+    </w:p>
+    <w:p>
+      <w:r>
+        <w:t>La documentación /docs es servida por FastAPI y funciona sin recursos externos. Incluye el contrato de POST /predict, un formulario de prueba y acceso al esquema OpenAPI generado en /openapi.json. El resultado de la prueba queda visible en la captura.</w:t>
+      </w:r>
+    </w:p>
+    <w:p>
+      <w:r>
+        <w:t>Docker Compose inició dos contenedores con estados healthy: api y web. El healthcheck de web consulta /health de la API con un timeout breve, por lo que refleja la disponibilidad del flujo completo. Este estado es local y no equivale a monitoreo productivo.</w:t>
+      </w:r>
+    </w:p>
+    <w:p>
+      <w:r>
+        <w:drawing>
+          <wp:inline xmlns:a="http://schemas.openxmlformats.org/drawingml/2006/main" xmlns:pic="http://schemas.openxmlformats.org/drawingml/2006/picture">
+            <wp:extent cx="3168000" cy="4031775"/>
+            <wp:docPr id="3" name="Picture 3"/>
+            <wp:cNvGraphicFramePr>
+              <a:graphicFrameLocks noChangeAspect="1"/>
+            </wp:cNvGraphicFramePr>
+            <a:graphic>
+              <a:graphicData uri="http://schemas.openxmlformats.org/drawingml/2006/picture">
+                <pic:pic>
+                  <pic:nvPicPr>
+                    <pic:cNvPr id="0" name="api_docs.png"/>
+                    <pic:cNvPicPr/>
+                  </pic:nvPicPr>
+                  <pic:blipFill>
+                    <a:blip r:embed="rId12"/>
+                    <a:stretch>
+                      <a:fillRect/>
+                    </a:stretch>
+                  </pic:blipFill>
+                  <pic:spPr>
+                    <a:xfrm>
+                      <a:off x="0" y="0"/>
+                      <a:ext cx="3168000" cy="4031775"/>
+                    </a:xfrm>
+                    <a:prstGeom prst="rect"/>
+                  </pic:spPr>
+                </pic:pic>
+              </a:graphicData>
+            </a:graphic>
+          </wp:inline>
+        </w:drawing>
+      </w:r>
+    </w:p>
+    <w:p>
+      <w:r>
+        <w:t>Figura 3. Prueba interactiva de /docs en FastAPI.</w:t>
       </w:r>
     </w:p>
     <w:p>
@@ -541,7 +847,7 @@
     </w:p>
     <w:p>
       <w:r>
-        <w:t>Para completar la actividad se debe vincular el proyecto con la evaluación anterior, incorporar antecedentes empresariales verificables, realizar las pruebas de usabilidad y publicar el código. La validación con demanda real permitirá discutir si los errores son aceptables para la decisión de inventario.</w:t>
+        <w:t>Para completar la actividad se debe verificar el vínculo con la evaluación anterior, incorporar antecedentes empresariales verificables y realizar las pruebas de usabilidad. La validación con demanda real permitirá discutir si los errores son aceptables para la decisión de inventario.</w:t>
       </w:r>
     </w:p>
     <w:p>

</xml_diff>